<commit_message>
updating the model with snapshot weight of 3, and adding visuals
</commit_message>
<xml_diff>
--- a/Morteza_Notes.docx
+++ b/Morteza_Notes.docx
@@ -23,13 +23,28 @@
     </w:p>
     <w:p/>
     <w:p>
-      <w:r>
+      <w:pPr>
+        <w:spacing w:after="0" w:line="276" w:lineRule="auto"/>
+        <w:rPr>
+          <w:rFonts w:ascii="Arial" w:hAnsi="Arial" w:cs="Arial"/>
+        </w:rPr>
+      </w:pPr>
+      <w:r>
+        <w:rPr>
+          <w:rFonts w:ascii="Arial" w:hAnsi="Arial" w:cs="Arial"/>
+        </w:rPr>
         <w:t>Improvement</w:t>
       </w:r>
       <w:r>
+        <w:rPr>
+          <w:rFonts w:ascii="Arial" w:hAnsi="Arial" w:cs="Arial"/>
+        </w:rPr>
         <w:t xml:space="preserve"> ideas</w:t>
       </w:r>
       <w:r>
+        <w:rPr>
+          <w:rFonts w:ascii="Arial" w:hAnsi="Arial" w:cs="Arial"/>
+        </w:rPr>
         <w:t>:</w:t>
       </w:r>
     </w:p>
@@ -40,8 +55,15 @@
           <w:ilvl w:val="0"/>
           <w:numId w:val="1"/>
         </w:numPr>
-      </w:pPr>
-      <w:r>
+        <w:spacing w:after="0" w:line="276" w:lineRule="auto"/>
+        <w:rPr>
+          <w:rFonts w:ascii="Arial" w:hAnsi="Arial" w:cs="Arial"/>
+        </w:rPr>
+      </w:pPr>
+      <w:r>
+        <w:rPr>
+          <w:rFonts w:ascii="Arial" w:hAnsi="Arial" w:cs="Arial"/>
+        </w:rPr>
         <w:t>Finding Load Time Series of the Country for 2025 (currently 2013)</w:t>
       </w:r>
     </w:p>
@@ -52,8 +74,15 @@
           <w:ilvl w:val="0"/>
           <w:numId w:val="1"/>
         </w:numPr>
-      </w:pPr>
-      <w:r>
+        <w:spacing w:after="0" w:line="276" w:lineRule="auto"/>
+        <w:rPr>
+          <w:rFonts w:ascii="Arial" w:hAnsi="Arial" w:cs="Arial"/>
+        </w:rPr>
+      </w:pPr>
+      <w:r>
+        <w:rPr>
+          <w:rFonts w:ascii="Arial" w:hAnsi="Arial" w:cs="Arial"/>
+        </w:rPr>
         <w:t>Distribute Load per Region based on GDP Share (currently population)</w:t>
       </w:r>
     </w:p>
@@ -64,19 +93,31 @@
           <w:ilvl w:val="0"/>
           <w:numId w:val="1"/>
         </w:numPr>
-      </w:pPr>
-      <w:r>
+        <w:spacing w:after="0" w:line="276" w:lineRule="auto"/>
+        <w:rPr>
+          <w:rFonts w:ascii="Arial" w:hAnsi="Arial" w:cs="Arial"/>
+        </w:rPr>
+      </w:pPr>
+      <w:r>
+        <w:rPr>
+          <w:rFonts w:ascii="Arial" w:hAnsi="Arial" w:cs="Arial"/>
+        </w:rPr>
         <w:t>Use the following link for more update existing Power Plants:</w:t>
       </w:r>
     </w:p>
     <w:p>
       <w:pPr>
         <w:pStyle w:val="ListParagraph"/>
+        <w:spacing w:after="0" w:line="276" w:lineRule="auto"/>
+        <w:rPr>
+          <w:rFonts w:ascii="Arial" w:hAnsi="Arial" w:cs="Arial"/>
+        </w:rPr>
       </w:pPr>
       <w:hyperlink r:id="rId5" w:history="1">
         <w:r>
           <w:rPr>
             <w:rStyle w:val="Hyperlink"/>
+            <w:rFonts w:ascii="Arial" w:hAnsi="Arial" w:cs="Arial"/>
           </w:rPr>
           <w:t>https://globalenergymonitor.org/projects/global-integrated-power-tracker/tracker-map/</w:t>
         </w:r>
@@ -89,23 +130,31 @@
           <w:ilvl w:val="0"/>
           <w:numId w:val="1"/>
         </w:numPr>
-      </w:pPr>
-      <w:r>
+        <w:spacing w:after="0" w:line="276" w:lineRule="auto"/>
+        <w:rPr>
+          <w:rFonts w:ascii="Arial" w:hAnsi="Arial" w:cs="Arial"/>
+        </w:rPr>
+      </w:pPr>
+      <w:r>
+        <w:rPr>
+          <w:rFonts w:ascii="Arial" w:hAnsi="Arial" w:cs="Arial"/>
+        </w:rPr>
         <w:t>Using Grid Data instead of one Bus per Region</w:t>
       </w:r>
     </w:p>
     <w:p>
       <w:pPr>
         <w:pStyle w:val="ListParagraph"/>
-      </w:pPr>
-      <w:r>
-        <w:t xml:space="preserve">(maybe from: </w:t>
-      </w:r>
-      <w:r>
-        <w:t>https://openinframap.org/#1.87/31.6/68.96/P</w:t>
-      </w:r>
-      <w:r>
-        <w:t>)</w:t>
+        <w:spacing w:after="0" w:line="276" w:lineRule="auto"/>
+        <w:rPr>
+          <w:rFonts w:ascii="Arial" w:hAnsi="Arial" w:cs="Arial"/>
+        </w:rPr>
+      </w:pPr>
+      <w:r>
+        <w:rPr>
+          <w:rFonts w:ascii="Arial" w:hAnsi="Arial" w:cs="Arial"/>
+        </w:rPr>
+        <w:t>(maybe from: https://openinframap.org/#1.87/31.6/68.96/P)</w:t>
       </w:r>
     </w:p>
     <w:p>
@@ -115,8 +164,15 @@
           <w:ilvl w:val="0"/>
           <w:numId w:val="1"/>
         </w:numPr>
-      </w:pPr>
-      <w:r>
+        <w:spacing w:after="0" w:line="276" w:lineRule="auto"/>
+        <w:rPr>
+          <w:rFonts w:ascii="Arial" w:hAnsi="Arial" w:cs="Arial"/>
+        </w:rPr>
+      </w:pPr>
+      <w:r>
+        <w:rPr>
+          <w:rFonts w:ascii="Arial" w:hAnsi="Arial" w:cs="Arial"/>
+        </w:rPr>
         <w:t>Considering Import and Export with neighboring countries</w:t>
       </w:r>
     </w:p>
@@ -127,16 +183,33 @@
           <w:ilvl w:val="0"/>
           <w:numId w:val="1"/>
         </w:numPr>
-      </w:pPr>
-      <w:r>
+        <w:spacing w:after="0" w:line="276" w:lineRule="auto"/>
+        <w:rPr>
+          <w:rFonts w:ascii="Arial" w:hAnsi="Arial" w:cs="Arial"/>
+          <w:strike/>
+        </w:rPr>
+      </w:pPr>
+      <w:r>
+        <w:rPr>
+          <w:rFonts w:ascii="Arial" w:hAnsi="Arial" w:cs="Arial"/>
+          <w:strike/>
+        </w:rPr>
         <w:t xml:space="preserve">Adding offshore generation to the buses in the </w:t>
       </w:r>
       <w:proofErr w:type="spellStart"/>
       <w:r>
+        <w:rPr>
+          <w:rFonts w:ascii="Arial" w:hAnsi="Arial" w:cs="Arial"/>
+          <w:strike/>
+        </w:rPr>
         <w:t>eez</w:t>
       </w:r>
       <w:proofErr w:type="spellEnd"/>
       <w:r>
+        <w:rPr>
+          <w:rFonts w:ascii="Arial" w:hAnsi="Arial" w:cs="Arial"/>
+          <w:strike/>
+        </w:rPr>
         <w:t xml:space="preserve"> and not neighboring countries directly</w:t>
       </w:r>
     </w:p>
@@ -147,32 +220,57 @@
           <w:ilvl w:val="0"/>
           <w:numId w:val="1"/>
         </w:numPr>
+        <w:spacing w:after="0" w:line="276" w:lineRule="auto"/>
+        <w:rPr>
+          <w:rFonts w:ascii="Arial" w:hAnsi="Arial" w:cs="Arial"/>
+        </w:rPr>
       </w:pPr>
       <w:proofErr w:type="spellStart"/>
       <w:r>
+        <w:rPr>
+          <w:rFonts w:ascii="Arial" w:hAnsi="Arial" w:cs="Arial"/>
+        </w:rPr>
         <w:t>Deviding</w:t>
       </w:r>
       <w:proofErr w:type="spellEnd"/>
       <w:r>
+        <w:rPr>
+          <w:rFonts w:ascii="Arial" w:hAnsi="Arial" w:cs="Arial"/>
+        </w:rPr>
         <w:t xml:space="preserve"> </w:t>
       </w:r>
       <w:proofErr w:type="spellStart"/>
       <w:r>
+        <w:rPr>
+          <w:rFonts w:ascii="Arial" w:hAnsi="Arial" w:cs="Arial"/>
+        </w:rPr>
         <w:t>eez</w:t>
       </w:r>
       <w:proofErr w:type="spellEnd"/>
       <w:r>
+        <w:rPr>
+          <w:rFonts w:ascii="Arial" w:hAnsi="Arial" w:cs="Arial"/>
+        </w:rPr>
         <w:t xml:space="preserve"> areas </w:t>
       </w:r>
       <w:r>
+        <w:rPr>
+          <w:rFonts w:ascii="Arial" w:hAnsi="Arial" w:cs="Arial"/>
+        </w:rPr>
         <w:t>in more details, not only the two regions of “</w:t>
       </w:r>
       <w:proofErr w:type="gramStart"/>
       <w:r>
+        <w:rPr>
+          <w:rFonts w:ascii="Arial" w:hAnsi="Arial" w:cs="Arial"/>
+        </w:rPr>
         <w:t>Caspian sea</w:t>
       </w:r>
       <w:proofErr w:type="gramEnd"/>
       <w:r>
+        <w:rPr>
+          <w:rFonts w:ascii="Arial" w:hAnsi="Arial" w:cs="Arial"/>
+        </w:rPr>
         <w:t>” and “Persian Gulf”</w:t>
       </w:r>
     </w:p>
@@ -183,11 +281,21 @@
           <w:ilvl w:val="0"/>
           <w:numId w:val="1"/>
         </w:numPr>
-      </w:pPr>
-      <w:r>
+        <w:spacing w:after="0" w:line="276" w:lineRule="auto"/>
+        <w:rPr>
+          <w:rFonts w:ascii="Arial" w:hAnsi="Arial" w:cs="Arial"/>
+        </w:rPr>
+      </w:pPr>
+      <w:r>
+        <w:rPr>
+          <w:rFonts w:ascii="Arial" w:hAnsi="Arial" w:cs="Arial"/>
+        </w:rPr>
         <w:t>Considering the currency yea</w:t>
       </w:r>
       <w:r>
+        <w:rPr>
+          <w:rFonts w:ascii="Arial" w:hAnsi="Arial" w:cs="Arial"/>
+        </w:rPr>
         <w:t>r</w:t>
       </w:r>
     </w:p>
@@ -198,8 +306,15 @@
           <w:ilvl w:val="0"/>
           <w:numId w:val="1"/>
         </w:numPr>
-      </w:pPr>
-      <w:r>
+        <w:spacing w:after="0" w:line="276" w:lineRule="auto"/>
+        <w:rPr>
+          <w:rFonts w:ascii="Arial" w:hAnsi="Arial" w:cs="Arial"/>
+        </w:rPr>
+      </w:pPr>
+      <w:r>
+        <w:rPr>
+          <w:rFonts w:ascii="Arial" w:hAnsi="Arial" w:cs="Arial"/>
+        </w:rPr>
         <w:t>Considering different technologies of gas, oil and nuclear</w:t>
       </w:r>
     </w:p>
@@ -210,8 +325,15 @@
           <w:ilvl w:val="0"/>
           <w:numId w:val="1"/>
         </w:numPr>
-      </w:pPr>
-      <w:r>
+        <w:spacing w:after="0" w:line="276" w:lineRule="auto"/>
+        <w:rPr>
+          <w:rFonts w:ascii="Arial" w:hAnsi="Arial" w:cs="Arial"/>
+        </w:rPr>
+      </w:pPr>
+      <w:r>
+        <w:rPr>
+          <w:rFonts w:ascii="Arial" w:hAnsi="Arial" w:cs="Arial"/>
+        </w:rPr>
         <w:t>Gas is only CCGT in our case, do it with more details</w:t>
       </w:r>
     </w:p>
@@ -222,28 +344,41 @@
           <w:ilvl w:val="0"/>
           <w:numId w:val="1"/>
         </w:numPr>
+        <w:spacing w:after="0" w:line="276" w:lineRule="auto"/>
+        <w:rPr>
+          <w:rFonts w:ascii="Arial" w:hAnsi="Arial" w:cs="Arial"/>
+        </w:rPr>
       </w:pPr>
       <w:proofErr w:type="spellStart"/>
       <w:r>
+        <w:rPr>
+          <w:rFonts w:ascii="Arial" w:hAnsi="Arial" w:cs="Arial"/>
+        </w:rPr>
         <w:t>StorageUnit</w:t>
       </w:r>
       <w:proofErr w:type="spellEnd"/>
       <w:r>
-        <w:t xml:space="preserve"> consideration: only “battery storage” &amp; “</w:t>
-      </w:r>
-      <w:r>
-        <w:t>hydrogen storage tank type 1</w:t>
-      </w:r>
-      <w:r>
-        <w:t xml:space="preserve">” </w:t>
-      </w:r>
-      <w:r>
+        <w:rPr>
+          <w:rFonts w:ascii="Arial" w:hAnsi="Arial" w:cs="Arial"/>
+        </w:rPr>
+        <w:t xml:space="preserve"> consideration: only “battery storage” &amp; “hydrogen storage tank type 1” </w:t>
+      </w:r>
+      <w:r>
+        <w:rPr>
+          <w:rFonts w:ascii="Arial" w:hAnsi="Arial" w:cs="Arial"/>
+        </w:rPr>
         <w:sym w:font="Wingdings" w:char="F0E0"/>
       </w:r>
       <w:r>
+        <w:rPr>
+          <w:rFonts w:ascii="Arial" w:hAnsi="Arial" w:cs="Arial"/>
+        </w:rPr>
         <w:t xml:space="preserve"> extend this</w:t>
       </w:r>
       <w:r>
+        <w:rPr>
+          <w:rFonts w:ascii="Arial" w:hAnsi="Arial" w:cs="Arial"/>
+        </w:rPr>
         <w:t xml:space="preserve"> properly</w:t>
       </w:r>
     </w:p>
@@ -254,8 +389,15 @@
           <w:ilvl w:val="0"/>
           <w:numId w:val="1"/>
         </w:numPr>
-      </w:pPr>
-      <w:r>
+        <w:spacing w:after="0" w:line="276" w:lineRule="auto"/>
+        <w:rPr>
+          <w:rFonts w:ascii="Arial" w:hAnsi="Arial" w:cs="Arial"/>
+        </w:rPr>
+      </w:pPr>
+      <w:r>
+        <w:rPr>
+          <w:rFonts w:ascii="Arial" w:hAnsi="Arial" w:cs="Arial"/>
+        </w:rPr>
         <w:t>The model is 3 hourly, consider an hourly model</w:t>
       </w:r>
     </w:p>
@@ -266,16 +408,33 @@
           <w:ilvl w:val="0"/>
           <w:numId w:val="1"/>
         </w:numPr>
-      </w:pPr>
-      <w:r>
+        <w:spacing w:after="0" w:line="276" w:lineRule="auto"/>
+        <w:rPr>
+          <w:rFonts w:ascii="Arial" w:hAnsi="Arial" w:cs="Arial"/>
+          <w:strike/>
+        </w:rPr>
+      </w:pPr>
+      <w:r>
+        <w:rPr>
+          <w:rFonts w:ascii="Arial" w:hAnsi="Arial" w:cs="Arial"/>
+          <w:strike/>
+        </w:rPr>
         <w:t xml:space="preserve">For considering the costs, look at workshop 10: </w:t>
       </w:r>
       <w:proofErr w:type="spellStart"/>
       <w:r>
+        <w:rPr>
+          <w:rFonts w:ascii="Arial" w:hAnsi="Arial" w:cs="Arial"/>
+          <w:strike/>
+        </w:rPr>
         <w:t>pypsa</w:t>
       </w:r>
       <w:proofErr w:type="spellEnd"/>
       <w:r>
+        <w:rPr>
+          <w:rFonts w:ascii="Arial" w:hAnsi="Arial" w:cs="Arial"/>
+          <w:strike/>
+        </w:rPr>
         <w:t>-cem.</w:t>
       </w:r>
     </w:p>
@@ -286,24 +445,54 @@
           <w:ilvl w:val="0"/>
           <w:numId w:val="1"/>
         </w:numPr>
-      </w:pPr>
-      <w:r>
+        <w:spacing w:after="0" w:line="276" w:lineRule="auto"/>
+        <w:rPr>
+          <w:rFonts w:ascii="Arial" w:hAnsi="Arial" w:cs="Arial"/>
+        </w:rPr>
+      </w:pPr>
+      <w:r>
+        <w:rPr>
+          <w:rFonts w:ascii="Arial" w:hAnsi="Arial" w:cs="Arial"/>
+        </w:rPr>
         <w:t>Consideration of different ramp up and down time and costs of different technologies</w:t>
       </w:r>
     </w:p>
     <w:p>
       <w:pPr>
-        <w:pStyle w:val="ListParagraph"/>
+        <w:pStyle w:val="NormalWeb"/>
         <w:numPr>
           <w:ilvl w:val="0"/>
           <w:numId w:val="1"/>
         </w:numPr>
-      </w:pPr>
-      <w:proofErr w:type="spellStart"/>
-      <w:r>
-        <w:t>yvqq</w:t>
-      </w:r>
-      <w:proofErr w:type="spellEnd"/>
+        <w:spacing w:before="0" w:beforeAutospacing="0" w:after="0" w:afterAutospacing="0" w:line="276" w:lineRule="auto"/>
+        <w:textAlignment w:val="baseline"/>
+        <w:rPr>
+          <w:rFonts w:ascii="Arial" w:hAnsi="Arial" w:cs="Arial"/>
+          <w:color w:val="000000"/>
+        </w:rPr>
+      </w:pPr>
+      <w:r>
+        <w:rPr>
+          <w:rFonts w:ascii="Arial" w:hAnsi="Arial" w:cs="Arial"/>
+          <w:color w:val="000000"/>
+        </w:rPr>
+        <w:t>Global fuel prices may overestimate costs for Iran; consider domestic extraction costs and export opportunity costs</w:t>
+      </w:r>
+    </w:p>
+    <w:p>
+      <w:pPr>
+        <w:pStyle w:val="NormalWeb"/>
+        <w:numPr>
+          <w:ilvl w:val="0"/>
+          <w:numId w:val="1"/>
+        </w:numPr>
+        <w:spacing w:before="0" w:beforeAutospacing="0" w:after="0" w:afterAutospacing="0" w:line="276" w:lineRule="auto"/>
+        <w:textAlignment w:val="baseline"/>
+        <w:rPr>
+          <w:rFonts w:ascii="Arial" w:hAnsi="Arial" w:cs="Arial"/>
+          <w:color w:val="000000"/>
+        </w:rPr>
+      </w:pPr>
     </w:p>
     <w:sectPr>
       <w:pgSz w:w="12240" w:h="15840"/>
@@ -318,6 +507,155 @@
 <file path=word/numbering.xml><?xml version="1.0" encoding="utf-8"?>
 <w:numbering xmlns:wpc="http://schemas.microsoft.com/office/word/2010/wordprocessingCanvas" xmlns:cx="http://schemas.microsoft.com/office/drawing/2014/chartex" xmlns:cx1="http://schemas.microsoft.com/office/drawing/2015/9/8/chartex" xmlns:cx2="http://schemas.microsoft.com/office/drawing/2015/10/21/chartex" xmlns:cx3="http://schemas.microsoft.com/office/drawing/2016/5/9/chartex" xmlns:cx4="http://schemas.microsoft.com/office/drawing/2016/5/10/chartex" xmlns:cx5="http://schemas.microsoft.com/office/drawing/2016/5/11/chartex" xmlns:cx6="http://schemas.microsoft.com/office/drawing/2016/5/12/chartex" xmlns:cx7="http://schemas.microsoft.com/office/drawing/2016/5/13/chartex" xmlns:cx8="http://schemas.microsoft.com/office/drawing/2016/5/14/chartex" xmlns:mc="http://schemas.openxmlformats.org/markup-compatibility/2006" xmlns:aink="http://schemas.microsoft.com/office/drawing/2016/ink" xmlns:am3d="http://schemas.microsoft.com/office/drawing/2017/model3d" xmlns:o="urn:schemas-microsoft-com:office:office" xmlns:oel="http://schemas.microsoft.com/office/2019/extlst" xmlns:r="http://schemas.openxmlformats.org/officeDocument/2006/relationships" xmlns:m="http://schemas.openxmlformats.org/officeDocument/2006/math" xmlns:v="urn:schemas-microsoft-com:vml" xmlns:wp14="http://schemas.microsoft.com/office/word/2010/wordprocessingDrawing" xmlns:wp="http://schemas.openxmlformats.org/drawingml/2006/wordprocessingDrawing" xmlns:w10="urn:schemas-microsoft-com:office:word" xmlns:w="http://schemas.openxmlformats.org/wordprocessingml/2006/main" xmlns:w14="http://schemas.microsoft.com/office/word/2010/wordml" xmlns:w15="http://schemas.microsoft.com/office/word/2012/wordml" xmlns:w16cex="http://schemas.microsoft.com/office/word/2018/wordml/cex" xmlns:w16cid="http://schemas.microsoft.com/office/word/2016/wordml/cid" xmlns:w16="http://schemas.microsoft.com/office/word/2018/wordml" xmlns:w16du="http://schemas.microsoft.com/office/word/2023/wordml/word16du" xmlns:w16sdtdh="http://schemas.microsoft.com/office/word/2020/wordml/sdtdatahash" xmlns:w16sdtfl="http://schemas.microsoft.com/office/word/2024/wordml/sdtformatlock" xmlns:w16se="http://schemas.microsoft.com/office/word/2015/wordml/symex" xmlns:wpg="http://schemas.microsoft.com/office/word/2010/wordprocessingGroup" xmlns:wpi="http://schemas.microsoft.com/office/word/2010/wordprocessingInk" xmlns:wne="http://schemas.microsoft.com/office/word/2006/wordml" xmlns:wps="http://schemas.microsoft.com/office/word/2010/wordprocessingShape" mc:Ignorable="w14 w15 w16se w16cid w16 w16cex w16sdtdh w16sdtfl w16du wp14">
   <w:abstractNum w:abstractNumId="0" w15:restartNumberingAfterBreak="0">
+    <w:nsid w:val="7230666E"/>
+    <w:multiLevelType w:val="multilevel"/>
+    <w:tmpl w:val="A6044FAA"/>
+    <w:lvl w:ilvl="0">
+      <w:start w:val="1"/>
+      <w:numFmt w:val="bullet"/>
+      <w:lvlText w:val=""/>
+      <w:lvlJc w:val="left"/>
+      <w:pPr>
+        <w:tabs>
+          <w:tab w:val="num" w:pos="720"/>
+        </w:tabs>
+        <w:ind w:left="720" w:hanging="360"/>
+      </w:pPr>
+      <w:rPr>
+        <w:rFonts w:ascii="Symbol" w:hAnsi="Symbol" w:hint="default"/>
+        <w:sz w:val="20"/>
+      </w:rPr>
+    </w:lvl>
+    <w:lvl w:ilvl="1" w:tentative="1">
+      <w:start w:val="1"/>
+      <w:numFmt w:val="bullet"/>
+      <w:lvlText w:val="o"/>
+      <w:lvlJc w:val="left"/>
+      <w:pPr>
+        <w:tabs>
+          <w:tab w:val="num" w:pos="1440"/>
+        </w:tabs>
+        <w:ind w:left="1440" w:hanging="360"/>
+      </w:pPr>
+      <w:rPr>
+        <w:rFonts w:ascii="Courier New" w:hAnsi="Courier New" w:hint="default"/>
+        <w:sz w:val="20"/>
+      </w:rPr>
+    </w:lvl>
+    <w:lvl w:ilvl="2" w:tentative="1">
+      <w:start w:val="1"/>
+      <w:numFmt w:val="bullet"/>
+      <w:lvlText w:val=""/>
+      <w:lvlJc w:val="left"/>
+      <w:pPr>
+        <w:tabs>
+          <w:tab w:val="num" w:pos="2160"/>
+        </w:tabs>
+        <w:ind w:left="2160" w:hanging="360"/>
+      </w:pPr>
+      <w:rPr>
+        <w:rFonts w:ascii="Wingdings" w:hAnsi="Wingdings" w:hint="default"/>
+        <w:sz w:val="20"/>
+      </w:rPr>
+    </w:lvl>
+    <w:lvl w:ilvl="3" w:tentative="1">
+      <w:start w:val="1"/>
+      <w:numFmt w:val="bullet"/>
+      <w:lvlText w:val=""/>
+      <w:lvlJc w:val="left"/>
+      <w:pPr>
+        <w:tabs>
+          <w:tab w:val="num" w:pos="2880"/>
+        </w:tabs>
+        <w:ind w:left="2880" w:hanging="360"/>
+      </w:pPr>
+      <w:rPr>
+        <w:rFonts w:ascii="Wingdings" w:hAnsi="Wingdings" w:hint="default"/>
+        <w:sz w:val="20"/>
+      </w:rPr>
+    </w:lvl>
+    <w:lvl w:ilvl="4" w:tentative="1">
+      <w:start w:val="1"/>
+      <w:numFmt w:val="bullet"/>
+      <w:lvlText w:val=""/>
+      <w:lvlJc w:val="left"/>
+      <w:pPr>
+        <w:tabs>
+          <w:tab w:val="num" w:pos="3600"/>
+        </w:tabs>
+        <w:ind w:left="3600" w:hanging="360"/>
+      </w:pPr>
+      <w:rPr>
+        <w:rFonts w:ascii="Wingdings" w:hAnsi="Wingdings" w:hint="default"/>
+        <w:sz w:val="20"/>
+      </w:rPr>
+    </w:lvl>
+    <w:lvl w:ilvl="5" w:tentative="1">
+      <w:start w:val="1"/>
+      <w:numFmt w:val="bullet"/>
+      <w:lvlText w:val=""/>
+      <w:lvlJc w:val="left"/>
+      <w:pPr>
+        <w:tabs>
+          <w:tab w:val="num" w:pos="4320"/>
+        </w:tabs>
+        <w:ind w:left="4320" w:hanging="360"/>
+      </w:pPr>
+      <w:rPr>
+        <w:rFonts w:ascii="Wingdings" w:hAnsi="Wingdings" w:hint="default"/>
+        <w:sz w:val="20"/>
+      </w:rPr>
+    </w:lvl>
+    <w:lvl w:ilvl="6" w:tentative="1">
+      <w:start w:val="1"/>
+      <w:numFmt w:val="bullet"/>
+      <w:lvlText w:val=""/>
+      <w:lvlJc w:val="left"/>
+      <w:pPr>
+        <w:tabs>
+          <w:tab w:val="num" w:pos="5040"/>
+        </w:tabs>
+        <w:ind w:left="5040" w:hanging="360"/>
+      </w:pPr>
+      <w:rPr>
+        <w:rFonts w:ascii="Wingdings" w:hAnsi="Wingdings" w:hint="default"/>
+        <w:sz w:val="20"/>
+      </w:rPr>
+    </w:lvl>
+    <w:lvl w:ilvl="7" w:tentative="1">
+      <w:start w:val="1"/>
+      <w:numFmt w:val="bullet"/>
+      <w:lvlText w:val=""/>
+      <w:lvlJc w:val="left"/>
+      <w:pPr>
+        <w:tabs>
+          <w:tab w:val="num" w:pos="5760"/>
+        </w:tabs>
+        <w:ind w:left="5760" w:hanging="360"/>
+      </w:pPr>
+      <w:rPr>
+        <w:rFonts w:ascii="Wingdings" w:hAnsi="Wingdings" w:hint="default"/>
+        <w:sz w:val="20"/>
+      </w:rPr>
+    </w:lvl>
+    <w:lvl w:ilvl="8" w:tentative="1">
+      <w:start w:val="1"/>
+      <w:numFmt w:val="bullet"/>
+      <w:lvlText w:val=""/>
+      <w:lvlJc w:val="left"/>
+      <w:pPr>
+        <w:tabs>
+          <w:tab w:val="num" w:pos="6480"/>
+        </w:tabs>
+        <w:ind w:left="6480" w:hanging="360"/>
+      </w:pPr>
+      <w:rPr>
+        <w:rFonts w:ascii="Wingdings" w:hAnsi="Wingdings" w:hint="default"/>
+        <w:sz w:val="20"/>
+      </w:rPr>
+    </w:lvl>
+  </w:abstractNum>
+  <w:abstractNum w:abstractNumId="1" w15:restartNumberingAfterBreak="0">
     <w:nsid w:val="7BA41862"/>
     <w:multiLevelType w:val="hybridMultilevel"/>
     <w:tmpl w:val="3F5278C6"/>
@@ -430,6 +768,9 @@
     </w:lvl>
   </w:abstractNum>
   <w:num w:numId="1" w16cid:durableId="813717055">
+    <w:abstractNumId w:val="1"/>
+  </w:num>
+  <w:num w:numId="2" w16cid:durableId="1241601824">
     <w:abstractNumId w:val="0"/>
   </w:num>
 </w:numbering>
@@ -1375,6 +1716,21 @@
       <w:shd w:val="clear" w:color="auto" w:fill="E1DFDD"/>
     </w:rPr>
   </w:style>
+  <w:style w:type="paragraph" w:styleId="NormalWeb">
+    <w:name w:val="Normal (Web)"/>
+    <w:basedOn w:val="Normal"/>
+    <w:uiPriority w:val="99"/>
+    <w:unhideWhenUsed/>
+    <w:rsid w:val="00371232"/>
+    <w:pPr>
+      <w:spacing w:before="100" w:beforeAutospacing="1" w:after="100" w:afterAutospacing="1" w:line="240" w:lineRule="auto"/>
+    </w:pPr>
+    <w:rPr>
+      <w:rFonts w:ascii="Times New Roman" w:eastAsia="Times New Roman" w:hAnsi="Times New Roman" w:cs="Times New Roman"/>
+      <w:kern w:val="0"/>
+      <w14:ligatures w14:val="none"/>
+    </w:rPr>
+  </w:style>
 </w:styles>
 </file>
 

</xml_diff>

<commit_message>
updating the cyclic state of storages as True and updating the results
</commit_message>
<xml_diff>
--- a/Morteza_Notes.docx
+++ b/Morteza_Notes.docx
@@ -493,6 +493,13 @@
           <w:color w:val="000000"/>
         </w:rPr>
       </w:pPr>
+      <w:r>
+        <w:rPr>
+          <w:rFonts w:ascii="Arial" w:hAnsi="Arial" w:cs="Arial"/>
+          <w:color w:val="000000"/>
+        </w:rPr>
+        <w:t>Run a model for current real situation. (RE not extandable)</w:t>
+      </w:r>
     </w:p>
     <w:sectPr>
       <w:pgSz w:w="12240" w:h="15840"/>

</xml_diff>